<commit_message>
Ajuste termo de saída e acompanhamento
</commit_message>
<xml_diff>
--- a/backend-python/docs/forms/termo_de_autorizacao_saida_desacompanhada.docx
+++ b/backend-python/docs/forms/termo_de_autorizacao_saida_desacompanhada.docx
@@ -19,8 +19,6 @@
           <w:szCs w:val="32"/>
         </w:rPr>
       </w:pPr>
-      <w:bookmarkStart w:id="0" w:name="_GoBack"/>
-      <w:bookmarkEnd w:id="0"/>
     </w:p>
     <w:p>
       <w:pPr>
@@ -212,7 +210,14 @@
           <w:sz w:val="24"/>
           <w:szCs w:val="24"/>
         </w:rPr>
-        <w:t>{{</w:t>
+        <w:t>{{nome_responsavel}}</w:t>
+      </w:r>
+      <w:r>
+        <w:rPr>
+          <w:sz w:val="24"/>
+          <w:szCs w:val="24"/>
+        </w:rPr>
+        <w:t xml:space="preserve"> portador do RG: </w:t>
       </w:r>
       <w:r>
         <w:rPr>
@@ -221,14 +226,14 @@
           <w:sz w:val="24"/>
           <w:szCs w:val="24"/>
         </w:rPr>
-        <w:t>nome_responsavel}}</w:t>
+        <w:t>{{rg_responsavel}}</w:t>
       </w:r>
       <w:r>
         <w:rPr>
           <w:sz w:val="24"/>
           <w:szCs w:val="24"/>
         </w:rPr>
-        <w:t xml:space="preserve"> portador do RG: </w:t>
+        <w:t xml:space="preserve"> ,responsável legal pelo(a) criança/adolescente matriculado nesta instituição</w:t>
       </w:r>
       <w:r>
         <w:rPr>
@@ -237,7 +242,14 @@
           <w:sz w:val="24"/>
           <w:szCs w:val="24"/>
         </w:rPr>
-        <w:t>{{</w:t>
+        <w:t xml:space="preserve"> {{nome_crianca}}</w:t>
+      </w:r>
+      <w:r>
+        <w:rPr>
+          <w:sz w:val="24"/>
+          <w:szCs w:val="24"/>
+        </w:rPr>
+        <w:t xml:space="preserve">,  para frequência nas atividades no período da </w:t>
       </w:r>
       <w:r>
         <w:rPr>
@@ -246,57 +258,7 @@
           <w:sz w:val="24"/>
           <w:szCs w:val="24"/>
         </w:rPr>
-        <w:t>rg_responsavel}}</w:t>
-      </w:r>
-      <w:r>
-        <w:rPr>
-          <w:sz w:val="24"/>
-          <w:szCs w:val="24"/>
-        </w:rPr>
-        <w:t xml:space="preserve"> ,responsável legal pelo(a) criança/adolescente matriculado nesta instituição</w:t>
-      </w:r>
-      <w:r>
-        <w:rPr>
-          <w:b/>
-          <w:bCs/>
-          <w:sz w:val="24"/>
-          <w:szCs w:val="24"/>
-        </w:rPr>
-        <w:t xml:space="preserve"> {{</w:t>
-      </w:r>
-      <w:r>
-        <w:rPr>
-          <w:b/>
-          <w:bCs/>
-          <w:sz w:val="24"/>
-          <w:szCs w:val="24"/>
-        </w:rPr>
-        <w:t>nome_crianca}}</w:t>
-      </w:r>
-      <w:r>
-        <w:rPr>
-          <w:sz w:val="24"/>
-          <w:szCs w:val="24"/>
-        </w:rPr>
-        <w:t xml:space="preserve">,  para frequência nas atividades no período da </w:t>
-      </w:r>
-      <w:r>
-        <w:rPr>
-          <w:b/>
-          <w:bCs/>
-          <w:sz w:val="24"/>
-          <w:szCs w:val="24"/>
-        </w:rPr>
-        <w:t>{{</w:t>
-      </w:r>
-      <w:r>
-        <w:rPr>
-          <w:b/>
-          <w:bCs/>
-          <w:sz w:val="24"/>
-          <w:szCs w:val="24"/>
-        </w:rPr>
-        <w:t>periodo_atividades}}</w:t>
+        <w:t>{{periodo_atividades}}</w:t>
       </w:r>
       <w:r>
         <w:rPr>
@@ -351,21 +313,27 @@
         <w:t>(</w:t>
       </w:r>
       <w:r>
-        <w:rPr>
-          <w:b/>
-          <w:bCs/>
-        </w:rPr>
-        <w:t>{{</w:t>
-      </w:r>
-      <w:r>
-        <w:rPr>
-          <w:b/>
-          <w:bCs/>
-        </w:rPr>
-        <w:t>autorizacao_saida_autoriza}}</w:t>
-      </w:r>
-      <w:r>
-        <w:t>) AUTORIZO antecipadamente, a saída desacompanhada do menor após o encerramento das atividades, o período especificado, de segunda a sexta-feira, bem como em eventos que possam ocorrer ocasionalmente aos finais de semana.</w:t>
+        <w:t xml:space="preserve"> </w:t>
+      </w:r>
+      <w:r>
+        <w:t>{{autorizacao_sai</w:t>
+      </w:r>
+      <w:bookmarkStart w:id="0" w:name="_GoBack"/>
+      <w:bookmarkEnd w:id="0"/>
+      <w:r>
+        <w:t>da_sim</w:t>
+      </w:r>
+      <w:r>
+        <w:t>}}</w:t>
+      </w:r>
+      <w:r>
+        <w:t xml:space="preserve"> </w:t>
+      </w:r>
+      <w:r>
+        <w:t>)</w:t>
+      </w:r>
+      <w:r>
+        <w:t xml:space="preserve"> AUTORIZO antecipadamente, a saída desacompanhada do menor após o encerramento das atividades, o período especificado, de segunda a sexta-feira, bem como em eventos que possam ocorrer ocasionalmente aos finais de semana.</w:t>
       </w:r>
     </w:p>
     <w:p>
@@ -380,18 +348,13 @@
         <w:t>(</w:t>
       </w:r>
       <w:r>
-        <w:rPr>
-          <w:b/>
-          <w:bCs/>
-        </w:rPr>
-        <w:t>{{</w:t>
-      </w:r>
-      <w:r>
-        <w:rPr>
-          <w:b/>
-          <w:bCs/>
-        </w:rPr>
-        <w:t>autorizacao_saida_nao_autoriza}}</w:t>
+        <w:t xml:space="preserve"> </w:t>
+      </w:r>
+      <w:r>
+        <w:t>{{autorizacao_saida_nao}}</w:t>
+      </w:r>
+      <w:r>
+        <w:t xml:space="preserve"> </w:t>
       </w:r>
       <w:r>
         <w:t>)</w:t>
@@ -543,17 +506,7 @@
           <w:sz w:val="16"/>
           <w:szCs w:val="16"/>
         </w:rPr>
-        <w:t>•Qualquer alteração ou imprevisto referent</w:t>
-      </w:r>
-      <w:r>
-        <w:rPr>
-          <w:i/>
-          <w:iCs/>
-          <w:color w:val="000000"/>
-          <w:sz w:val="16"/>
-          <w:szCs w:val="16"/>
-        </w:rPr>
-        <w:t>e a liberação da criança/adolescente deve ser comunicada imediatamente à Equipe Técnica.</w:t>
+        <w:t>•Qualquer alteração ou imprevisto referente a liberação da criança/adolescente deve ser comunicada imediatamente à Equipe Técnica.</w:t>
       </w:r>
     </w:p>
     <w:p>
@@ -601,17 +554,7 @@
           <w:sz w:val="16"/>
           <w:szCs w:val="16"/>
         </w:rPr>
-        <w:t>•Atenção: A criança/adolescente não autorizada a sair deverá aguardar seus pais/responsáveis dentro do espaço da OSC, não sendo permitida sua saída com outras pessoas</w:t>
-      </w:r>
-      <w:r>
-        <w:rPr>
-          <w:i/>
-          <w:iCs/>
-          <w:color w:val="000000"/>
-          <w:sz w:val="16"/>
-          <w:szCs w:val="16"/>
-        </w:rPr>
-        <w:t xml:space="preserve"> (pais de amigos, pais de alunos, parentes ou conhecidos) sem estarem devidamente autorizados antecipadamente.</w:t>
+        <w:t>•Atenção: A criança/adolescente não autorizada a sair deverá aguardar seus pais/responsáveis dentro do espaço da OSC, não sendo permitida sua saída com outras pessoas (pais de amigos, pais de alunos, parentes ou conhecidos) sem estarem devidamente autorizados antecipadamente.</w:t>
       </w:r>
     </w:p>
     <w:p>
@@ -696,14 +639,7 @@
           <w:sz w:val="24"/>
           <w:szCs w:val="24"/>
         </w:rPr>
-        <w:t>Out</w:t>
-      </w:r>
-      <w:r>
-        <w:rPr>
-          <w:sz w:val="24"/>
-          <w:szCs w:val="24"/>
-        </w:rPr>
-        <w:t>ros responsáveis:</w:t>
+        <w:t>Outros responsáveis:</w:t>
       </w:r>
     </w:p>
     <w:p>
@@ -911,15 +847,7 @@
                 <w:sz w:val="18"/>
                 <w:szCs w:val="18"/>
               </w:rPr>
-              <w:t>{{</w:t>
-            </w:r>
-            <w:r>
-              <w:rPr>
-                <w:rFonts w:ascii="Times New Roman" w:eastAsia="Times New Roman" w:hAnsi="Times New Roman" w:cs="Times New Roman"/>
-                <w:sz w:val="18"/>
-                <w:szCs w:val="18"/>
-              </w:rPr>
-              <w:t>resp_1_nome}}</w:t>
+              <w:t>{{resp_1_nome}}</w:t>
             </w:r>
           </w:p>
         </w:tc>
@@ -949,15 +877,7 @@
                 <w:sz w:val="18"/>
                 <w:szCs w:val="18"/>
               </w:rPr>
-              <w:t>{{</w:t>
-            </w:r>
-            <w:r>
-              <w:rPr>
-                <w:rFonts w:ascii="Times New Roman" w:eastAsia="Times New Roman" w:hAnsi="Times New Roman" w:cs="Times New Roman"/>
-                <w:sz w:val="18"/>
-                <w:szCs w:val="18"/>
-              </w:rPr>
-              <w:t>resp_1_parentesco}}</w:t>
+              <w:t>{{resp_1_parentesco}}</w:t>
             </w:r>
           </w:p>
         </w:tc>
@@ -1022,15 +942,7 @@
                 <w:sz w:val="18"/>
                 <w:szCs w:val="18"/>
               </w:rPr>
-              <w:t>{{</w:t>
-            </w:r>
-            <w:r>
-              <w:rPr>
-                <w:rFonts w:ascii="Times New Roman" w:eastAsia="Times New Roman" w:hAnsi="Times New Roman" w:cs="Times New Roman"/>
-                <w:sz w:val="18"/>
-                <w:szCs w:val="18"/>
-              </w:rPr>
-              <w:t>resp_2_nome}}</w:t>
+              <w:t>{{resp_2_nome}}</w:t>
             </w:r>
           </w:p>
         </w:tc>
@@ -1060,15 +972,7 @@
                 <w:sz w:val="18"/>
                 <w:szCs w:val="18"/>
               </w:rPr>
-              <w:t>{{</w:t>
-            </w:r>
-            <w:r>
-              <w:rPr>
-                <w:rFonts w:ascii="Times New Roman" w:eastAsia="Times New Roman" w:hAnsi="Times New Roman" w:cs="Times New Roman"/>
-                <w:sz w:val="18"/>
-                <w:szCs w:val="18"/>
-              </w:rPr>
-              <w:t>resp_2_parentesco}}</w:t>
+              <w:t>{{resp_2_parentesco}}</w:t>
             </w:r>
           </w:p>
         </w:tc>
@@ -1133,15 +1037,7 @@
                 <w:sz w:val="18"/>
                 <w:szCs w:val="18"/>
               </w:rPr>
-              <w:t>{{</w:t>
-            </w:r>
-            <w:r>
-              <w:rPr>
-                <w:rFonts w:ascii="Times New Roman" w:eastAsia="Times New Roman" w:hAnsi="Times New Roman" w:cs="Times New Roman"/>
-                <w:sz w:val="18"/>
-                <w:szCs w:val="18"/>
-              </w:rPr>
-              <w:t>resp_3_nome}}</w:t>
+              <w:t>{{resp_3_nome}}</w:t>
             </w:r>
           </w:p>
         </w:tc>
@@ -1171,15 +1067,7 @@
                 <w:sz w:val="18"/>
                 <w:szCs w:val="18"/>
               </w:rPr>
-              <w:t>{{</w:t>
-            </w:r>
-            <w:r>
-              <w:rPr>
-                <w:rFonts w:ascii="Times New Roman" w:eastAsia="Times New Roman" w:hAnsi="Times New Roman" w:cs="Times New Roman"/>
-                <w:sz w:val="18"/>
-                <w:szCs w:val="18"/>
-              </w:rPr>
-              <w:t>resp_3_parentesco}}</w:t>
+              <w:t>{{resp_3_parentesco}}</w:t>
             </w:r>
           </w:p>
         </w:tc>
@@ -1244,15 +1132,7 @@
                 <w:sz w:val="18"/>
                 <w:szCs w:val="18"/>
               </w:rPr>
-              <w:t>{{</w:t>
-            </w:r>
-            <w:r>
-              <w:rPr>
-                <w:rFonts w:ascii="Times New Roman" w:eastAsia="Times New Roman" w:hAnsi="Times New Roman" w:cs="Times New Roman"/>
-                <w:sz w:val="18"/>
-                <w:szCs w:val="18"/>
-              </w:rPr>
-              <w:t>resp_4_nome}}</w:t>
+              <w:t>{{resp_4_nome}}</w:t>
             </w:r>
           </w:p>
         </w:tc>
@@ -1282,15 +1162,7 @@
                 <w:sz w:val="18"/>
                 <w:szCs w:val="18"/>
               </w:rPr>
-              <w:t>{{</w:t>
-            </w:r>
-            <w:r>
-              <w:rPr>
-                <w:rFonts w:ascii="Times New Roman" w:eastAsia="Times New Roman" w:hAnsi="Times New Roman" w:cs="Times New Roman"/>
-                <w:sz w:val="18"/>
-                <w:szCs w:val="18"/>
-              </w:rPr>
-              <w:t>resp_4_parentesco}}</w:t>
+              <w:t>{{resp_4_parentesco}}</w:t>
             </w:r>
           </w:p>
         </w:tc>
@@ -1355,15 +1227,7 @@
                 <w:sz w:val="18"/>
                 <w:szCs w:val="18"/>
               </w:rPr>
-              <w:t>{{</w:t>
-            </w:r>
-            <w:r>
-              <w:rPr>
-                <w:rFonts w:ascii="Times New Roman" w:eastAsia="Times New Roman" w:hAnsi="Times New Roman" w:cs="Times New Roman"/>
-                <w:sz w:val="18"/>
-                <w:szCs w:val="18"/>
-              </w:rPr>
-              <w:t>resp_5_nome}}</w:t>
+              <w:t>{{resp_5_nome}}</w:t>
             </w:r>
           </w:p>
         </w:tc>
@@ -1393,15 +1257,7 @@
                 <w:sz w:val="18"/>
                 <w:szCs w:val="18"/>
               </w:rPr>
-              <w:t>{{</w:t>
-            </w:r>
-            <w:r>
-              <w:rPr>
-                <w:rFonts w:ascii="Times New Roman" w:eastAsia="Times New Roman" w:hAnsi="Times New Roman" w:cs="Times New Roman"/>
-                <w:sz w:val="18"/>
-                <w:szCs w:val="18"/>
-              </w:rPr>
-              <w:t>resp_5_parentesco}}</w:t>
+              <w:t>{{resp_5_parentesco}}</w:t>
             </w:r>
           </w:p>
         </w:tc>
@@ -1462,52 +1318,7 @@
           <w:sz w:val="24"/>
           <w:szCs w:val="24"/>
         </w:rPr>
-        <w:t>Taboão da Serra, {{</w:t>
-      </w:r>
-      <w:r>
-        <w:rPr>
-          <w:b/>
-          <w:bCs/>
-          <w:sz w:val="24"/>
-          <w:szCs w:val="24"/>
-        </w:rPr>
-        <w:t>dia}}</w:t>
-      </w:r>
-      <w:r>
-        <w:rPr>
-          <w:b/>
-          <w:bCs/>
-          <w:sz w:val="24"/>
-          <w:szCs w:val="24"/>
-        </w:rPr>
-        <w:t xml:space="preserve"> de {{</w:t>
-      </w:r>
-      <w:r>
-        <w:rPr>
-          <w:b/>
-          <w:bCs/>
-          <w:sz w:val="24"/>
-          <w:szCs w:val="24"/>
-        </w:rPr>
-        <w:t>mes}}</w:t>
-      </w:r>
-      <w:r>
-        <w:rPr>
-          <w:b/>
-          <w:bCs/>
-          <w:sz w:val="24"/>
-          <w:szCs w:val="24"/>
-        </w:rPr>
-        <w:t xml:space="preserve"> de {{</w:t>
-      </w:r>
-      <w:r>
-        <w:rPr>
-          <w:b/>
-          <w:bCs/>
-          <w:sz w:val="24"/>
-          <w:szCs w:val="24"/>
-        </w:rPr>
-        <w:t>ano}}</w:t>
+        <w:t>Taboão da Serra, {{dia}} de {{mes}} de {{ano}}</w:t>
       </w:r>
     </w:p>
     <w:p>
@@ -1648,7 +1459,7 @@
               </wp:anchor>
             </w:drawing>
           </mc:Choice>
-          <mc:Fallback xmlns:cr="http://schemas.microsoft.com/office/comments/2020/reactions" xmlns="http://schemas.microsoft.com/office/tasks/2019/documenttasks" xmlns:dgm="http://schemas.openxmlformats.org/drawingml/2006/diagram" xmlns:lc="http://schemas.openxmlformats.org/drawingml/2006/lockedCanvas" xmlns:c="http://schemas.openxmlformats.org/drawingml/2006/chart" xmlns:pic="http://schemas.openxmlformats.org/drawingml/2006/picture" xmlns:a="http://schemas.openxmlformats.org/drawingml/2006/main" xmlns:sl="http://schemas.openxmlformats.org/schemaLibrary/2006/main">
+          <mc:Fallback xmlns:sl="http://schemas.openxmlformats.org/schemaLibrary/2006/main" xmlns:a="http://schemas.openxmlformats.org/drawingml/2006/main" xmlns:pic="http://schemas.openxmlformats.org/drawingml/2006/picture" xmlns:c="http://schemas.openxmlformats.org/drawingml/2006/chart" xmlns:lc="http://schemas.openxmlformats.org/drawingml/2006/lockedCanvas" xmlns:dgm="http://schemas.openxmlformats.org/drawingml/2006/diagram" xmlns="http://schemas.microsoft.com/office/tasks/2019/documenttasks" xmlns:cr="http://schemas.microsoft.com/office/comments/2020/reactions">
             <w:drawing>
               <wp:anchor allowOverlap="1" behindDoc="0" distB="0" distT="0" distL="0" distR="0" hidden="0" layoutInCell="1" locked="0" relativeHeight="0" simplePos="0">
                 <wp:simplePos x="0" y="0"/>

</xml_diff>